<commit_message>
loops and functions array
</commit_message>
<xml_diff>
--- a/Powershell Notes PDF/Practice Questions.docx
+++ b/Powershell Notes PDF/Practice Questions.docx
@@ -4,6 +4,11 @@
   <w:body>
     <w:p>
       <w:pPr>
+        <w:pStyle w:val="ListParagraph"/>
+        <w:numPr>
+          <w:ilvl w:val="0"/>
+          <w:numId w:val="1"/>
+        </w:numPr>
         <w:autoSpaceDE w:val="0"/>
         <w:autoSpaceDN w:val="0"/>
         <w:adjustRightInd w:val="0"/>
@@ -22,13 +27,16 @@
           <w:szCs w:val="23"/>
           <w:lang w:bidi="hi-IN"/>
         </w:rPr>
-        <w:t>1. Check whether a number is even or odd.</w:t>
+        <w:t>Check whether a number is even or odd.</w:t>
       </w:r>
-      <w:bookmarkStart w:id="0" w:name="_GoBack"/>
-      <w:bookmarkEnd w:id="0"/>
     </w:p>
     <w:p>
       <w:pPr>
+        <w:pStyle w:val="ListParagraph"/>
+        <w:numPr>
+          <w:ilvl w:val="0"/>
+          <w:numId w:val="1"/>
+        </w:numPr>
         <w:autoSpaceDE w:val="0"/>
         <w:autoSpaceDN w:val="0"/>
         <w:adjustRightInd w:val="0"/>
@@ -47,11 +55,16 @@
           <w:szCs w:val="23"/>
           <w:lang w:bidi="hi-IN"/>
         </w:rPr>
-        <w:t>2. Print weekday using number.</w:t>
+        <w:t>Print weekday using number.</w:t>
       </w:r>
     </w:p>
     <w:p>
       <w:pPr>
+        <w:pStyle w:val="ListParagraph"/>
+        <w:numPr>
+          <w:ilvl w:val="0"/>
+          <w:numId w:val="1"/>
+        </w:numPr>
         <w:rPr>
           <w:rFonts w:ascii="CIDFont+F2" w:eastAsia="CIDFont+F2" w:cs="CIDFont+F2"/>
           <w:sz w:val="23"/>
@@ -66,10 +79,23 @@
           <w:szCs w:val="23"/>
           <w:lang w:bidi="hi-IN"/>
         </w:rPr>
-        <w:t>3. Print month name using month number.</w:t>
+        <w:t>Print month name using month number.</w:t>
       </w:r>
     </w:p>
     <w:p>
+      <w:pPr>
+        <w:pStyle w:val="ListParagraph"/>
+        <w:numPr>
+          <w:ilvl w:val="0"/>
+          <w:numId w:val="1"/>
+        </w:numPr>
+        <w:rPr>
+          <w:rFonts w:ascii="CIDFont+F2" w:eastAsia="CIDFont+F2" w:cs="CIDFont+F2"/>
+          <w:sz w:val="23"/>
+          <w:szCs w:val="23"/>
+          <w:lang w:bidi="hi-IN"/>
+        </w:rPr>
+      </w:pPr>
       <w:r>
         <w:rPr>
           <w:rFonts w:ascii="CIDFont+F2" w:eastAsia="CIDFont+F2" w:cs="CIDFont+F2"/>
@@ -77,7 +103,100 @@
           <w:szCs w:val="23"/>
           <w:lang w:bidi="hi-IN"/>
         </w:rPr>
-        <w:t>4. Check whether a number is positive, negative, or zero.</w:t>
+        <w:t>Check whether a number is positive, negative, or zero.</w:t>
+      </w:r>
+    </w:p>
+    <w:p>
+      <w:pPr>
+        <w:rPr>
+          <w:rFonts w:ascii="CIDFont+F2" w:eastAsia="CIDFont+F2" w:cs="CIDFont+F2"/>
+          <w:b/>
+          <w:bCs/>
+          <w:sz w:val="23"/>
+          <w:szCs w:val="23"/>
+          <w:lang w:bidi="hi-IN"/>
+        </w:rPr>
+      </w:pPr>
+    </w:p>
+    <w:p>
+      <w:pPr>
+        <w:rPr>
+          <w:rFonts w:ascii="CIDFont+F2" w:eastAsia="CIDFont+F2" w:cs="CIDFont+F2"/>
+          <w:b/>
+          <w:bCs/>
+          <w:sz w:val="23"/>
+          <w:szCs w:val="23"/>
+          <w:lang w:bidi="hi-IN"/>
+        </w:rPr>
+      </w:pPr>
+      <w:r>
+        <w:rPr>
+          <w:rFonts w:ascii="CIDFont+F2" w:eastAsia="CIDFont+F2" w:cs="CIDFont+F2"/>
+          <w:b/>
+          <w:bCs/>
+          <w:sz w:val="23"/>
+          <w:szCs w:val="23"/>
+          <w:lang w:bidi="hi-IN"/>
+        </w:rPr>
+        <w:t>Function Based</w:t>
+      </w:r>
+      <w:bookmarkStart w:id="0" w:name="_GoBack"/>
+      <w:bookmarkEnd w:id="0"/>
+    </w:p>
+    <w:p>
+      <w:pPr>
+        <w:pStyle w:val="ListParagraph"/>
+        <w:numPr>
+          <w:ilvl w:val="0"/>
+          <w:numId w:val="1"/>
+        </w:numPr>
+        <w:autoSpaceDE w:val="0"/>
+        <w:autoSpaceDN w:val="0"/>
+        <w:adjustRightInd w:val="0"/>
+        <w:spacing w:after="0" w:line="240" w:lineRule="auto"/>
+        <w:rPr>
+          <w:rFonts w:ascii="CIDFont+F2" w:eastAsia="CIDFont+F2" w:cs="CIDFont+F2"/>
+          <w:sz w:val="23"/>
+          <w:szCs w:val="23"/>
+          <w:lang w:bidi="hi-IN"/>
+        </w:rPr>
+      </w:pPr>
+      <w:r>
+        <w:rPr>
+          <w:rFonts w:ascii="CIDFont+F2" w:eastAsia="CIDFont+F2" w:cs="CIDFont+F2"/>
+          <w:sz w:val="23"/>
+          <w:szCs w:val="23"/>
+          <w:lang w:bidi="hi-IN"/>
+        </w:rPr>
+        <w:t>Function to find cube.</w:t>
+      </w:r>
+    </w:p>
+    <w:p>
+      <w:pPr>
+        <w:pStyle w:val="ListParagraph"/>
+        <w:numPr>
+          <w:ilvl w:val="0"/>
+          <w:numId w:val="1"/>
+        </w:numPr>
+        <w:autoSpaceDE w:val="0"/>
+        <w:autoSpaceDN w:val="0"/>
+        <w:adjustRightInd w:val="0"/>
+        <w:spacing w:after="0" w:line="240" w:lineRule="auto"/>
+        <w:rPr>
+          <w:rFonts w:ascii="CIDFont+F2" w:eastAsia="CIDFont+F2" w:cs="CIDFont+F2"/>
+          <w:sz w:val="23"/>
+          <w:szCs w:val="23"/>
+          <w:lang w:bidi="hi-IN"/>
+        </w:rPr>
+      </w:pPr>
+      <w:r>
+        <w:rPr>
+          <w:rFonts w:ascii="CIDFont+F2" w:eastAsia="CIDFont+F2" w:cs="CIDFont+F2"/>
+          <w:sz w:val="23"/>
+          <w:szCs w:val="23"/>
+          <w:lang w:bidi="hi-IN"/>
+        </w:rPr>
+        <w:t>Function to check even/odd.</w:t>
       </w:r>
     </w:p>
     <w:sectPr>
@@ -88,6 +207,192 @@
     </w:sectPr>
   </w:body>
 </w:document>
+</file>
+
+<file path=word/numbering.xml><?xml version="1.0" encoding="utf-8"?>
+<w:numbering xmlns:wpc="http://schemas.microsoft.com/office/word/2010/wordprocessingCanvas" xmlns:cx="http://schemas.microsoft.com/office/drawing/2014/chartex" xmlns:cx1="http://schemas.microsoft.com/office/drawing/2015/9/8/chartex" xmlns:cx2="http://schemas.microsoft.com/office/drawing/2015/10/21/chartex" xmlns:cx3="http://schemas.microsoft.com/office/drawing/2016/5/9/chartex" xmlns:cx4="http://schemas.microsoft.com/office/drawing/2016/5/10/chartex" xmlns:cx5="http://schemas.microsoft.com/office/drawing/2016/5/11/chartex" xmlns:cx6="http://schemas.microsoft.com/office/drawing/2016/5/12/chartex" xmlns:cx7="http://schemas.microsoft.com/office/drawing/2016/5/13/chartex" xmlns:cx8="http://schemas.microsoft.com/office/drawing/2016/5/14/chartex" xmlns:mc="http://schemas.openxmlformats.org/markup-compatibility/2006" xmlns:aink="http://schemas.microsoft.com/office/drawing/2016/ink" xmlns:am3d="http://schemas.microsoft.com/office/drawing/2017/model3d" xmlns:o="urn:schemas-microsoft-com:office:office" xmlns:r="http://schemas.openxmlformats.org/officeDocument/2006/relationships" xmlns:m="http://schemas.openxmlformats.org/officeDocument/2006/math" xmlns:v="urn:schemas-microsoft-com:vml" xmlns:wp14="http://schemas.microsoft.com/office/word/2010/wordprocessingDrawing" xmlns:wp="http://schemas.openxmlformats.org/drawingml/2006/wordprocessingDrawing" xmlns:w10="urn:schemas-microsoft-com:office:word" xmlns:w="http://schemas.openxmlformats.org/wordprocessingml/2006/main" xmlns:w14="http://schemas.microsoft.com/office/word/2010/wordml" xmlns:w15="http://schemas.microsoft.com/office/word/2012/wordml" xmlns:w16cid="http://schemas.microsoft.com/office/word/2016/wordml/cid" xmlns:w16se="http://schemas.microsoft.com/office/word/2015/wordml/symex" xmlns:wpg="http://schemas.microsoft.com/office/word/2010/wordprocessingGroup" xmlns:wpi="http://schemas.microsoft.com/office/word/2010/wordprocessingInk" xmlns:wne="http://schemas.microsoft.com/office/word/2006/wordml" xmlns:wps="http://schemas.microsoft.com/office/word/2010/wordprocessingShape" mc:Ignorable="w14 w15 w16se w16cid wp14">
+  <w:abstractNum w:abstractNumId="0" w15:restartNumberingAfterBreak="0">
+    <w:nsid w:val="01D60AE9"/>
+    <w:multiLevelType w:val="hybridMultilevel"/>
+    <w:tmpl w:val="643A5C1C"/>
+    <w:lvl w:ilvl="0" w:tplc="4009000F">
+      <w:start w:val="1"/>
+      <w:numFmt w:val="decimal"/>
+      <w:lvlText w:val="%1."/>
+      <w:lvlJc w:val="left"/>
+      <w:pPr>
+        <w:ind w:left="720" w:hanging="360"/>
+      </w:pPr>
+    </w:lvl>
+    <w:lvl w:ilvl="1" w:tplc="40090019" w:tentative="1">
+      <w:start w:val="1"/>
+      <w:numFmt w:val="lowerLetter"/>
+      <w:lvlText w:val="%2."/>
+      <w:lvlJc w:val="left"/>
+      <w:pPr>
+        <w:ind w:left="1440" w:hanging="360"/>
+      </w:pPr>
+    </w:lvl>
+    <w:lvl w:ilvl="2" w:tplc="4009001B" w:tentative="1">
+      <w:start w:val="1"/>
+      <w:numFmt w:val="lowerRoman"/>
+      <w:lvlText w:val="%3."/>
+      <w:lvlJc w:val="right"/>
+      <w:pPr>
+        <w:ind w:left="2160" w:hanging="180"/>
+      </w:pPr>
+    </w:lvl>
+    <w:lvl w:ilvl="3" w:tplc="4009000F" w:tentative="1">
+      <w:start w:val="1"/>
+      <w:numFmt w:val="decimal"/>
+      <w:lvlText w:val="%4."/>
+      <w:lvlJc w:val="left"/>
+      <w:pPr>
+        <w:ind w:left="2880" w:hanging="360"/>
+      </w:pPr>
+    </w:lvl>
+    <w:lvl w:ilvl="4" w:tplc="40090019" w:tentative="1">
+      <w:start w:val="1"/>
+      <w:numFmt w:val="lowerLetter"/>
+      <w:lvlText w:val="%5."/>
+      <w:lvlJc w:val="left"/>
+      <w:pPr>
+        <w:ind w:left="3600" w:hanging="360"/>
+      </w:pPr>
+    </w:lvl>
+    <w:lvl w:ilvl="5" w:tplc="4009001B" w:tentative="1">
+      <w:start w:val="1"/>
+      <w:numFmt w:val="lowerRoman"/>
+      <w:lvlText w:val="%6."/>
+      <w:lvlJc w:val="right"/>
+      <w:pPr>
+        <w:ind w:left="4320" w:hanging="180"/>
+      </w:pPr>
+    </w:lvl>
+    <w:lvl w:ilvl="6" w:tplc="4009000F" w:tentative="1">
+      <w:start w:val="1"/>
+      <w:numFmt w:val="decimal"/>
+      <w:lvlText w:val="%7."/>
+      <w:lvlJc w:val="left"/>
+      <w:pPr>
+        <w:ind w:left="5040" w:hanging="360"/>
+      </w:pPr>
+    </w:lvl>
+    <w:lvl w:ilvl="7" w:tplc="40090019" w:tentative="1">
+      <w:start w:val="1"/>
+      <w:numFmt w:val="lowerLetter"/>
+      <w:lvlText w:val="%8."/>
+      <w:lvlJc w:val="left"/>
+      <w:pPr>
+        <w:ind w:left="5760" w:hanging="360"/>
+      </w:pPr>
+    </w:lvl>
+    <w:lvl w:ilvl="8" w:tplc="4009001B" w:tentative="1">
+      <w:start w:val="1"/>
+      <w:numFmt w:val="lowerRoman"/>
+      <w:lvlText w:val="%9."/>
+      <w:lvlJc w:val="right"/>
+      <w:pPr>
+        <w:ind w:left="6480" w:hanging="180"/>
+      </w:pPr>
+    </w:lvl>
+  </w:abstractNum>
+  <w:abstractNum w:abstractNumId="1" w15:restartNumberingAfterBreak="0">
+    <w:nsid w:val="5A1354D2"/>
+    <w:multiLevelType w:val="hybridMultilevel"/>
+    <w:tmpl w:val="9FAE7606"/>
+    <w:lvl w:ilvl="0" w:tplc="4009000F">
+      <w:start w:val="1"/>
+      <w:numFmt w:val="decimal"/>
+      <w:lvlText w:val="%1."/>
+      <w:lvlJc w:val="left"/>
+      <w:pPr>
+        <w:ind w:left="720" w:hanging="360"/>
+      </w:pPr>
+      <w:rPr>
+        <w:rFonts w:hint="default"/>
+      </w:rPr>
+    </w:lvl>
+    <w:lvl w:ilvl="1" w:tplc="40090019" w:tentative="1">
+      <w:start w:val="1"/>
+      <w:numFmt w:val="lowerLetter"/>
+      <w:lvlText w:val="%2."/>
+      <w:lvlJc w:val="left"/>
+      <w:pPr>
+        <w:ind w:left="1440" w:hanging="360"/>
+      </w:pPr>
+    </w:lvl>
+    <w:lvl w:ilvl="2" w:tplc="4009001B" w:tentative="1">
+      <w:start w:val="1"/>
+      <w:numFmt w:val="lowerRoman"/>
+      <w:lvlText w:val="%3."/>
+      <w:lvlJc w:val="right"/>
+      <w:pPr>
+        <w:ind w:left="2160" w:hanging="180"/>
+      </w:pPr>
+    </w:lvl>
+    <w:lvl w:ilvl="3" w:tplc="4009000F" w:tentative="1">
+      <w:start w:val="1"/>
+      <w:numFmt w:val="decimal"/>
+      <w:lvlText w:val="%4."/>
+      <w:lvlJc w:val="left"/>
+      <w:pPr>
+        <w:ind w:left="2880" w:hanging="360"/>
+      </w:pPr>
+    </w:lvl>
+    <w:lvl w:ilvl="4" w:tplc="40090019" w:tentative="1">
+      <w:start w:val="1"/>
+      <w:numFmt w:val="lowerLetter"/>
+      <w:lvlText w:val="%5."/>
+      <w:lvlJc w:val="left"/>
+      <w:pPr>
+        <w:ind w:left="3600" w:hanging="360"/>
+      </w:pPr>
+    </w:lvl>
+    <w:lvl w:ilvl="5" w:tplc="4009001B" w:tentative="1">
+      <w:start w:val="1"/>
+      <w:numFmt w:val="lowerRoman"/>
+      <w:lvlText w:val="%6."/>
+      <w:lvlJc w:val="right"/>
+      <w:pPr>
+        <w:ind w:left="4320" w:hanging="180"/>
+      </w:pPr>
+    </w:lvl>
+    <w:lvl w:ilvl="6" w:tplc="4009000F" w:tentative="1">
+      <w:start w:val="1"/>
+      <w:numFmt w:val="decimal"/>
+      <w:lvlText w:val="%7."/>
+      <w:lvlJc w:val="left"/>
+      <w:pPr>
+        <w:ind w:left="5040" w:hanging="360"/>
+      </w:pPr>
+    </w:lvl>
+    <w:lvl w:ilvl="7" w:tplc="40090019" w:tentative="1">
+      <w:start w:val="1"/>
+      <w:numFmt w:val="lowerLetter"/>
+      <w:lvlText w:val="%8."/>
+      <w:lvlJc w:val="left"/>
+      <w:pPr>
+        <w:ind w:left="5760" w:hanging="360"/>
+      </w:pPr>
+    </w:lvl>
+    <w:lvl w:ilvl="8" w:tplc="4009001B" w:tentative="1">
+      <w:start w:val="1"/>
+      <w:numFmt w:val="lowerRoman"/>
+      <w:lvlText w:val="%9."/>
+      <w:lvlJc w:val="right"/>
+      <w:pPr>
+        <w:ind w:left="6480" w:hanging="180"/>
+      </w:pPr>
+    </w:lvl>
+  </w:abstractNum>
+  <w:num w:numId="1">
+    <w:abstractNumId w:val="0"/>
+  </w:num>
+  <w:num w:numId="2">
+    <w:abstractNumId w:val="1"/>
+  </w:num>
+</w:numbering>
 </file>
 
 <file path=word/styles.xml><?xml version="1.0" encoding="utf-8"?>
@@ -1116,6 +1421,17 @@
       <w:outlineLvl w:val="9"/>
     </w:pPr>
   </w:style>
+  <w:style w:type="paragraph" w:styleId="ListParagraph">
+    <w:name w:val="List Paragraph"/>
+    <w:basedOn w:val="Normal"/>
+    <w:uiPriority w:val="34"/>
+    <w:qFormat/>
+    <w:rsid w:val="0076018A"/>
+    <w:pPr>
+      <w:ind w:left="720"/>
+      <w:contextualSpacing/>
+    </w:pPr>
+  </w:style>
 </w:styles>
 </file>
 

</xml_diff>